<commit_message>
Apply chart legibility fixes to Reports #1 and #2
Apply same chart improvements from Report #3 to Reports #1 and #2 for
consistency across the three-report suite:

- Gantt charts: switch to y-axis tick labels (colored by horizon)
  instead of text inside bars, preventing clipping/truncation
- Tornado charts: smart padding with offset points (25pt normal,
  50pt + vertical stagger for small bars)
- ROI titles: reduced font size to prevent truncation

https://claude.ai/code/session_011F2ZpxHnuQ8BtRbwuEkG6H
</commit_message>
<xml_diff>
--- a/PLMA_Credit_Risk_Assessment_2026.docx
+++ b/PLMA_Credit_Risk_Assessment_2026.docx
@@ -4412,7 +4412,7 @@
       <w:r>
         <w:drawing>
           <wp:inline xmlns:a="http://schemas.openxmlformats.org/drawingml/2006/main" xmlns:pic="http://schemas.openxmlformats.org/drawingml/2006/picture">
-            <wp:extent cx="5943600" cy="3674936"/>
+            <wp:extent cx="5943600" cy="3266846"/>
             <wp:docPr id="10" name="Picture 10"/>
             <wp:cNvGraphicFramePr>
               <a:graphicFrameLocks noChangeAspect="1"/>
@@ -4433,7 +4433,7 @@
                   <pic:spPr>
                     <a:xfrm>
                       <a:off x="0" y="0"/>
-                      <a:ext cx="5943600" cy="3674936"/>
+                      <a:ext cx="5943600" cy="3266846"/>
                     </a:xfrm>
                     <a:prstGeom prst="rect"/>
                   </pic:spPr>
@@ -7097,7 +7097,7 @@
       <w:r>
         <w:drawing>
           <wp:inline xmlns:a="http://schemas.openxmlformats.org/drawingml/2006/main" xmlns:pic="http://schemas.openxmlformats.org/drawingml/2006/picture">
-            <wp:extent cx="5943600" cy="3679035"/>
+            <wp:extent cx="5943600" cy="3675508"/>
             <wp:docPr id="12" name="Picture 12"/>
             <wp:cNvGraphicFramePr>
               <a:graphicFrameLocks noChangeAspect="1"/>
@@ -7118,7 +7118,7 @@
                   <pic:spPr>
                     <a:xfrm>
                       <a:off x="0" y="0"/>
-                      <a:ext cx="5943600" cy="3679035"/>
+                      <a:ext cx="5943600" cy="3675508"/>
                     </a:xfrm>
                     <a:prstGeom prst="rect"/>
                   </pic:spPr>
@@ -8129,7 +8129,7 @@
       <w:r>
         <w:drawing>
           <wp:inline xmlns:a="http://schemas.openxmlformats.org/drawingml/2006/main" xmlns:pic="http://schemas.openxmlformats.org/drawingml/2006/picture">
-            <wp:extent cx="5943600" cy="3197332"/>
+            <wp:extent cx="5943600" cy="3266472"/>
             <wp:docPr id="13" name="Picture 13"/>
             <wp:cNvGraphicFramePr>
               <a:graphicFrameLocks noChangeAspect="1"/>
@@ -8150,7 +8150,7 @@
                   <pic:spPr>
                     <a:xfrm>
                       <a:off x="0" y="0"/>
-                      <a:ext cx="5943600" cy="3197332"/>
+                      <a:ext cx="5943600" cy="3266472"/>
                     </a:xfrm>
                     <a:prstGeom prst="rect"/>
                   </pic:spPr>

</xml_diff>